<commit_message>
Adjust Rut & Yonah Footer Alignment
</commit_message>
<xml_diff>
--- a/01 Tanakh/02 Nevi_im/02 Minor Prophets/19 Yonah/Yonah 01.docx
+++ b/01 Tanakh/02 Nevi_im/02 Minor Prophets/19 Yonah/Yonah 01.docx
@@ -489,8 +489,8 @@
       <w:ind w:left="720" w:firstLine="0"/>
       <w:jc w:val="center"/>
       <w:rPr>
-        <w:sz w:val="18"/>
-        <w:szCs w:val="18"/>
+        <w:sz w:val="20"/>
+        <w:szCs w:val="20"/>
       </w:rPr>
     </w:pPr>
     <w:r>
@@ -746,11 +746,6 @@
       </w:rPr>
       <w:t xml:space="preserve">         </w:t>
       <w:tab/>
-    </w:r>
-    <w:r>
-      <w:rPr>
-        <w:rtl w:val="0"/>
-      </w:rPr>
     </w:r>
   </w:p>
 </w:ftr>

</xml_diff>